<commit_message>
Update Security Research file
</commit_message>
<xml_diff>
--- a/Security Research.docx
+++ b/Security Research.docx
@@ -72,25 +72,7 @@
           <w:color w:val="652B91"/>
           <w:rtl/>
         </w:rPr>
-        <w:t xml:space="preserve"> פשוט </w:t>
-      </w:r>
-      <w:proofErr w:type="spellStart"/>
-      <w:r>
-        <w:rPr>
-          <w:rFonts w:ascii="Tahoma" w:hAnsi="Tahoma" w:cs="Tahoma" w:hint="cs"/>
-          <w:color w:val="652B91"/>
-          <w:rtl/>
-        </w:rPr>
-        <w:t>הכל</w:t>
-      </w:r>
-      <w:proofErr w:type="spellEnd"/>
-      <w:r>
-        <w:rPr>
-          <w:rFonts w:ascii="Tahoma" w:hAnsi="Tahoma" w:cs="Tahoma" w:hint="cs"/>
-          <w:color w:val="652B91"/>
-          <w:rtl/>
-        </w:rPr>
-        <w:t xml:space="preserve">! בסיום המסמך יש סיכום של כל החולשות </w:t>
+        <w:t xml:space="preserve"> פשוט הכל! בסיום המסמך יש סיכום של כל החולשות </w:t>
       </w:r>
       <w:r>
         <w:rPr>
@@ -100,7 +82,6 @@
         </w:rPr>
         <w:t>שנמצאו ומוגשות. יחד עם המסמך יש להגיש את קבצי ה-</w:t>
       </w:r>
-      <w:proofErr w:type="spellStart"/>
       <w:r>
         <w:rPr>
           <w:rFonts w:ascii="Tahoma" w:hAnsi="Tahoma" w:cs="Tahoma"/>
@@ -108,7 +89,6 @@
         </w:rPr>
         <w:t>py</w:t>
       </w:r>
-      <w:proofErr w:type="spellEnd"/>
       <w:r>
         <w:rPr>
           <w:rFonts w:ascii="Tahoma" w:hAnsi="Tahoma" w:cs="Tahoma" w:hint="cs"/>
@@ -573,7 +553,6 @@
                 <w:color w:val="000000" w:themeColor="text1"/>
               </w:rPr>
             </w:pPr>
-            <w:proofErr w:type="spellStart"/>
             <w:r>
               <w:rPr>
                 <w:rFonts w:cstheme="minorHAnsi"/>
@@ -587,72 +566,41 @@
               </w:rPr>
               <w:t>_Number</w:t>
             </w:r>
-            <w:proofErr w:type="spellEnd"/>
             <w:r>
               <w:rPr>
                 <w:rFonts w:cstheme="minorHAnsi"/>
               </w:rPr>
-              <w:t>#{gli&amp;&amp;</w:t>
-            </w:r>
-            <w:proofErr w:type="gramStart"/>
+              <w:t>#{gli&amp;&amp;er}{</w:t>
+            </w:r>
             <w:r>
               <w:rPr>
                 <w:rFonts w:cstheme="minorHAnsi"/>
               </w:rPr>
-              <w:t>er}{</w:t>
-            </w:r>
-            <w:proofErr w:type="gramEnd"/>
+              <w:t>field_name</w:t>
+            </w:r>
             <w:r>
               <w:rPr>
                 <w:rFonts w:cstheme="minorHAnsi"/>
               </w:rPr>
+              <w:t>:</w:t>
+            </w:r>
+            <w:r>
+              <w:rPr>
+                <w:rFonts w:cstheme="minorHAnsi"/>
+              </w:rPr>
               <w:t>field_</w:t>
             </w:r>
-            <w:proofErr w:type="gramStart"/>
             <w:r>
               <w:rPr>
                 <w:rFonts w:cstheme="minorHAnsi"/>
               </w:rPr>
-              <w:t>name</w:t>
+              <w:t>value</w:t>
             </w:r>
             <w:r>
               <w:rPr>
                 <w:rFonts w:cstheme="minorHAnsi"/>
               </w:rPr>
-              <w:t>:</w:t>
-            </w:r>
-            <w:r>
-              <w:rPr>
-                <w:rFonts w:cstheme="minorHAnsi"/>
-              </w:rPr>
-              <w:t>field</w:t>
-            </w:r>
-            <w:proofErr w:type="gramEnd"/>
-            <w:r>
-              <w:rPr>
-                <w:rFonts w:cstheme="minorHAnsi"/>
-              </w:rPr>
-              <w:t>_</w:t>
-            </w:r>
-            <w:proofErr w:type="gramStart"/>
-            <w:r>
-              <w:rPr>
-                <w:rFonts w:cstheme="minorHAnsi"/>
-              </w:rPr>
-              <w:t>value</w:t>
-            </w:r>
-            <w:r>
-              <w:rPr>
-                <w:rFonts w:cstheme="minorHAnsi"/>
-              </w:rPr>
-              <w:t>}#</w:t>
-            </w:r>
-            <w:proofErr w:type="gramEnd"/>
-            <w:r>
-              <w:rPr>
-                <w:rFonts w:cstheme="minorHAnsi"/>
-              </w:rPr>
-              <w:t>#</w:t>
+              <w:t>}##</w:t>
             </w:r>
           </w:p>
         </w:tc>
@@ -725,34 +673,13 @@
               <w:t>#{</w:t>
             </w:r>
             <w:r>
-              <w:t>gli&amp;&amp;</w:t>
-            </w:r>
-            <w:proofErr w:type="gramStart"/>
-            <w:r>
-              <w:t>er}{</w:t>
-            </w:r>
-            <w:proofErr w:type="gramEnd"/>
-            <w:r>
-              <w:t>field_</w:t>
-            </w:r>
-            <w:proofErr w:type="gramStart"/>
-            <w:r>
-              <w:t>name:field</w:t>
-            </w:r>
-            <w:proofErr w:type="gramEnd"/>
-            <w:r>
-              <w:t>_</w:t>
-            </w:r>
-            <w:proofErr w:type="gramStart"/>
-            <w:r>
-              <w:t>valu</w:t>
-            </w:r>
-            <w:r>
-              <w:t>e}#</w:t>
-            </w:r>
-            <w:proofErr w:type="gramEnd"/>
-            <w:r>
-              <w:t>#</w:t>
+              <w:t>gli&amp;&amp;er}{</w:t>
+            </w:r>
+            <w:r>
+              <w:t>field_name:field_valu</w:t>
+            </w:r>
+            <w:r>
+              <w:t>e}##</w:t>
             </w:r>
           </w:p>
         </w:tc>
@@ -801,35 +728,7 @@
           <w:shd w:val="clear" w:color="auto" w:fill="D9D9D9" w:themeFill="background1" w:themeFillShade="D9"/>
           <w:rtl/>
         </w:rPr>
-        <w:t xml:space="preserve">קראו </w:t>
-      </w:r>
-      <w:proofErr w:type="spellStart"/>
-      <w:r>
-        <w:rPr>
-          <w:rFonts w:ascii="Tahoma" w:hAnsi="Tahoma" w:cs="Tahoma" w:hint="cs"/>
-          <w:b/>
-          <w:bCs/>
-          <w:color w:val="652B91"/>
-          <w:sz w:val="24"/>
-          <w:szCs w:val="24"/>
-          <w:shd w:val="clear" w:color="auto" w:fill="D9D9D9" w:themeFill="background1" w:themeFillShade="D9"/>
-          <w:rtl/>
-        </w:rPr>
-        <w:t>למדריכ</w:t>
-      </w:r>
-      <w:proofErr w:type="spellEnd"/>
-      <w:r>
-        <w:rPr>
-          <w:rFonts w:ascii="Tahoma" w:hAnsi="Tahoma" w:cs="Tahoma" w:hint="cs"/>
-          <w:b/>
-          <w:bCs/>
-          <w:color w:val="652B91"/>
-          <w:sz w:val="24"/>
-          <w:szCs w:val="24"/>
-          <w:shd w:val="clear" w:color="auto" w:fill="D9D9D9" w:themeFill="background1" w:themeFillShade="D9"/>
-          <w:rtl/>
-        </w:rPr>
-        <w:t>/ה לפני שאתם ממשיכים לשלב הבא!</w:t>
+        <w:t>קראו למדריכ/ה לפני שאתם ממשיכים לשלב הבא!</w:t>
       </w:r>
       <w:r>
         <w:rPr>
@@ -985,27 +884,7 @@
           <w:szCs w:val="24"/>
           <w:rtl/>
         </w:rPr>
-        <w:t xml:space="preserve">אתם </w:t>
-      </w:r>
-      <w:proofErr w:type="spellStart"/>
-      <w:r>
-        <w:rPr>
-          <w:rFonts w:ascii="Tahoma" w:hAnsi="Tahoma" w:cs="Tahoma" w:hint="cs"/>
-          <w:sz w:val="24"/>
-          <w:szCs w:val="24"/>
-          <w:rtl/>
-        </w:rPr>
-        <w:t>בסייקל</w:t>
-      </w:r>
-      <w:proofErr w:type="spellEnd"/>
-      <w:r>
-        <w:rPr>
-          <w:rFonts w:ascii="Tahoma" w:hAnsi="Tahoma" w:cs="Tahoma" w:hint="cs"/>
-          <w:sz w:val="24"/>
-          <w:szCs w:val="24"/>
-          <w:rtl/>
-        </w:rPr>
-        <w:t xml:space="preserve"> הראשון בכיתה </w:t>
+        <w:t xml:space="preserve">אתם בסייקל הראשון בכיתה </w:t>
       </w:r>
       <w:r>
         <w:rPr>
@@ -1401,29 +1280,7 @@
                 <w:szCs w:val="20"/>
                 <w:rtl/>
               </w:rPr>
-              <w:t xml:space="preserve">התנהגות לא צפויה, ביצוע לייקים </w:t>
-            </w:r>
-            <w:proofErr w:type="spellStart"/>
-            <w:r>
-              <w:rPr>
-                <w:rFonts w:ascii="Tahoma" w:hAnsi="Tahoma" w:cs="Tahoma" w:hint="cs"/>
-                <w:color w:val="000000" w:themeColor="text1"/>
-                <w:sz w:val="20"/>
-                <w:szCs w:val="20"/>
-                <w:rtl/>
-              </w:rPr>
-              <w:t>לגליטים</w:t>
-            </w:r>
-            <w:proofErr w:type="spellEnd"/>
-            <w:r>
-              <w:rPr>
-                <w:rFonts w:ascii="Tahoma" w:hAnsi="Tahoma" w:cs="Tahoma" w:hint="cs"/>
-                <w:color w:val="000000" w:themeColor="text1"/>
-                <w:sz w:val="20"/>
-                <w:szCs w:val="20"/>
-                <w:rtl/>
-              </w:rPr>
-              <w:t xml:space="preserve"> שאינם קיימים.</w:t>
+              <w:t>התנהגות לא צפויה, ביצוע לייקים לגליטים שאינם קיימים.</w:t>
             </w:r>
           </w:p>
         </w:tc>
@@ -2338,29 +2195,7 @@
                 <w:szCs w:val="20"/>
                 <w:rtl/>
               </w:rPr>
-              <w:t xml:space="preserve">התנהגות לא צפויה, פרסום תגובות </w:t>
-            </w:r>
-            <w:proofErr w:type="spellStart"/>
-            <w:r>
-              <w:rPr>
-                <w:rFonts w:ascii="Tahoma" w:hAnsi="Tahoma" w:cs="Tahoma" w:hint="cs"/>
-                <w:color w:val="000000" w:themeColor="text1"/>
-                <w:sz w:val="20"/>
-                <w:szCs w:val="20"/>
-                <w:rtl/>
-              </w:rPr>
-              <w:t>לגליטים</w:t>
-            </w:r>
-            <w:proofErr w:type="spellEnd"/>
-            <w:r>
-              <w:rPr>
-                <w:rFonts w:ascii="Tahoma" w:hAnsi="Tahoma" w:cs="Tahoma" w:hint="cs"/>
-                <w:color w:val="000000" w:themeColor="text1"/>
-                <w:sz w:val="20"/>
-                <w:szCs w:val="20"/>
-                <w:rtl/>
-              </w:rPr>
-              <w:t xml:space="preserve"> שאינם קיימים.</w:t>
+              <w:t>התנהגות לא צפויה, פרסום תגובות לגליטים שאינם קיימים.</w:t>
             </w:r>
           </w:p>
         </w:tc>
@@ -3311,20 +3146,8 @@
                 <w:szCs w:val="20"/>
                 <w:rtl/>
               </w:rPr>
-              <w:t xml:space="preserve">חסימת תווים מיוחדים מתוכן התגובה: '&lt;', '&gt;', '/' </w:t>
-            </w:r>
-            <w:proofErr w:type="spellStart"/>
-            <w:r>
-              <w:rPr>
-                <w:rFonts w:ascii="Tahoma" w:hAnsi="Tahoma" w:cs="Tahoma" w:hint="cs"/>
-                <w:color w:val="000000" w:themeColor="text1"/>
-                <w:sz w:val="20"/>
-                <w:szCs w:val="20"/>
-                <w:rtl/>
-              </w:rPr>
-              <w:t>וכו</w:t>
-            </w:r>
-            <w:proofErr w:type="spellEnd"/>
+              <w:t>חסימת תווים מיוחדים מתוכן התגובה: '&lt;', '&gt;', '/' וכו</w:t>
+            </w:r>
             <w:r>
               <w:rPr>
                 <w:rFonts w:ascii="Tahoma" w:hAnsi="Tahoma" w:cs="Tahoma"/>
@@ -3646,29 +3469,7 @@
                 <w:szCs w:val="20"/>
                 <w:rtl/>
               </w:rPr>
-              <w:t xml:space="preserve">התנהגות לא צפויה, ביצוע וואו </w:t>
-            </w:r>
-            <w:proofErr w:type="spellStart"/>
-            <w:r>
-              <w:rPr>
-                <w:rFonts w:ascii="Tahoma" w:hAnsi="Tahoma" w:cs="Tahoma" w:hint="cs"/>
-                <w:color w:val="000000" w:themeColor="text1"/>
-                <w:sz w:val="20"/>
-                <w:szCs w:val="20"/>
-                <w:rtl/>
-              </w:rPr>
-              <w:t>לגליטים</w:t>
-            </w:r>
-            <w:proofErr w:type="spellEnd"/>
-            <w:r>
-              <w:rPr>
-                <w:rFonts w:ascii="Tahoma" w:hAnsi="Tahoma" w:cs="Tahoma" w:hint="cs"/>
-                <w:color w:val="000000" w:themeColor="text1"/>
-                <w:sz w:val="20"/>
-                <w:szCs w:val="20"/>
-                <w:rtl/>
-              </w:rPr>
-              <w:t xml:space="preserve"> שאינם קיימים.</w:t>
+              <w:t>התנהגות לא צפויה, ביצוע וואו לגליטים שאינם קיימים.</w:t>
             </w:r>
           </w:p>
         </w:tc>
@@ -5517,20 +5318,8 @@
                 <w:szCs w:val="20"/>
                 <w:rtl/>
               </w:rPr>
-              <w:t xml:space="preserve">חסימת תווים מיוחדים מתוכן הגליט: '&lt;', '&gt;', '/' </w:t>
-            </w:r>
-            <w:proofErr w:type="spellStart"/>
-            <w:r>
-              <w:rPr>
-                <w:rFonts w:ascii="Tahoma" w:hAnsi="Tahoma" w:cs="Tahoma" w:hint="cs"/>
-                <w:color w:val="000000" w:themeColor="text1"/>
-                <w:sz w:val="20"/>
-                <w:szCs w:val="20"/>
-                <w:rtl/>
-              </w:rPr>
-              <w:t>וכו</w:t>
-            </w:r>
-            <w:proofErr w:type="spellEnd"/>
+              <w:t>חסימת תווים מיוחדים מתוכן הגליט: '&lt;', '&gt;', '/' וכו</w:t>
+            </w:r>
             <w:r>
               <w:rPr>
                 <w:rFonts w:ascii="Tahoma" w:hAnsi="Tahoma" w:cs="Tahoma"/>
@@ -9144,43 +8933,7 @@
                 <w:sz w:val="16"/>
                 <w:szCs w:val="16"/>
               </w:rPr>
-              <w:t>710#{gli&amp;&amp;</w:t>
-            </w:r>
-            <w:proofErr w:type="gramStart"/>
-            <w:r>
-              <w:rPr>
-                <w:rFonts w:ascii="Tahoma" w:hAnsi="Tahoma" w:cs="Tahoma"/>
-                <w:sz w:val="16"/>
-                <w:szCs w:val="16"/>
-              </w:rPr>
-              <w:t>er}{</w:t>
-            </w:r>
-            <w:proofErr w:type="gramEnd"/>
-            <w:r>
-              <w:rPr>
-                <w:rFonts w:ascii="Tahoma" w:hAnsi="Tahoma" w:cs="Tahoma"/>
-                <w:sz w:val="16"/>
-                <w:szCs w:val="16"/>
-              </w:rPr>
-              <w:t>"glit_id":164804,"user_id":68793,"user_screen_name":"lorem_ipsum","id</w:t>
-            </w:r>
-            <w:proofErr w:type="gramStart"/>
-            <w:r>
-              <w:rPr>
-                <w:rFonts w:ascii="Tahoma" w:hAnsi="Tahoma" w:cs="Tahoma"/>
-                <w:sz w:val="16"/>
-                <w:szCs w:val="16"/>
-              </w:rPr>
-              <w:t>":-1}#</w:t>
-            </w:r>
-            <w:proofErr w:type="gramEnd"/>
-            <w:r>
-              <w:rPr>
-                <w:rFonts w:ascii="Tahoma" w:hAnsi="Tahoma" w:cs="Tahoma"/>
-                <w:sz w:val="16"/>
-                <w:szCs w:val="16"/>
-              </w:rPr>
-              <w:t>#</w:t>
+              <w:t>710#{gli&amp;&amp;er}{"glit_id":164804,"user_id":68793,"user_screen_name":"lorem_ipsum","id":-1}##</w:t>
             </w:r>
           </w:p>
         </w:tc>
@@ -9715,47 +9468,7 @@
                 <w:sz w:val="16"/>
                 <w:szCs w:val="16"/>
               </w:rPr>
-              <w:t>715#Like publish approved{gli&amp;&amp;</w:t>
-            </w:r>
-            <w:proofErr w:type="gramStart"/>
-            <w:r>
-              <w:rPr>
-                <w:rFonts w:ascii="Tahoma" w:hAnsi="Tahoma" w:cs="Tahoma"/>
-                <w:color w:val="000000" w:themeColor="text1"/>
-                <w:sz w:val="16"/>
-                <w:szCs w:val="16"/>
-              </w:rPr>
-              <w:t>er}{</w:t>
-            </w:r>
-            <w:proofErr w:type="gramEnd"/>
-            <w:r>
-              <w:rPr>
-                <w:rFonts w:ascii="Tahoma" w:hAnsi="Tahoma" w:cs="Tahoma"/>
-                <w:color w:val="000000" w:themeColor="text1"/>
-                <w:sz w:val="16"/>
-                <w:szCs w:val="16"/>
-              </w:rPr>
-              <w:t>"glit_id":164804,"user_id":68793,"user_screen_name":"lorem_ipsum","id":2150319,"date":"2026-09-25T21:07:18.020Z</w:t>
-            </w:r>
-            <w:proofErr w:type="gramStart"/>
-            <w:r>
-              <w:rPr>
-                <w:rFonts w:ascii="Tahoma" w:hAnsi="Tahoma" w:cs="Tahoma"/>
-                <w:color w:val="000000" w:themeColor="text1"/>
-                <w:sz w:val="16"/>
-                <w:szCs w:val="16"/>
-              </w:rPr>
-              <w:t>"}#</w:t>
-            </w:r>
-            <w:proofErr w:type="gramEnd"/>
-            <w:r>
-              <w:rPr>
-                <w:rFonts w:ascii="Tahoma" w:hAnsi="Tahoma" w:cs="Tahoma"/>
-                <w:color w:val="000000" w:themeColor="text1"/>
-                <w:sz w:val="16"/>
-                <w:szCs w:val="16"/>
-              </w:rPr>
-              <w:t>#</w:t>
+              <w:t>715#Like publish approved{gli&amp;&amp;er}{"glit_id":164804,"user_id":68793,"user_screen_name":"lorem_ipsum","id":2150319,"date":"2026-09-25T21:07:18.020Z"}##</w:t>
             </w:r>
           </w:p>
         </w:tc>
@@ -9952,33 +9665,7 @@
                 <w:szCs w:val="24"/>
                 <w:rtl/>
               </w:rPr>
-              <w:t xml:space="preserve"> </w:t>
-            </w:r>
-            <w:proofErr w:type="spellStart"/>
-            <w:r>
-              <w:rPr>
-                <w:rFonts w:ascii="Tahoma" w:hAnsi="Tahoma" w:cs="Tahoma" w:hint="cs"/>
-                <w:b/>
-                <w:bCs/>
-                <w:color w:val="FFFFFF" w:themeColor="background1"/>
-                <w:sz w:val="24"/>
-                <w:szCs w:val="24"/>
-                <w:rtl/>
-              </w:rPr>
-              <w:t>לנק</w:t>
-            </w:r>
-            <w:proofErr w:type="spellEnd"/>
-            <w:r>
-              <w:rPr>
-                <w:rFonts w:ascii="Tahoma" w:hAnsi="Tahoma" w:cs="Tahoma" w:hint="cs"/>
-                <w:b/>
-                <w:bCs/>
-                <w:color w:val="FFFFFF" w:themeColor="background1"/>
-                <w:sz w:val="24"/>
-                <w:szCs w:val="24"/>
-                <w:rtl/>
-              </w:rPr>
-              <w:t xml:space="preserve">' </w:t>
+              <w:t xml:space="preserve"> לנק' </w:t>
             </w:r>
             <w:r>
               <w:rPr>
@@ -11467,67 +11154,7 @@
                 <w:sz w:val="16"/>
                 <w:szCs w:val="16"/>
               </w:rPr>
-              <w:t>650#{gli&amp;&amp;</w:t>
-            </w:r>
-            <w:proofErr w:type="gramStart"/>
-            <w:r>
-              <w:rPr>
-                <w:rFonts w:ascii="Tahoma" w:hAnsi="Tahoma" w:cs="Tahoma"/>
-                <w:color w:val="000000" w:themeColor="text1"/>
-                <w:sz w:val="16"/>
-                <w:szCs w:val="16"/>
-              </w:rPr>
-              <w:t>er}{</w:t>
-            </w:r>
-            <w:proofErr w:type="gramEnd"/>
-            <w:r>
-              <w:rPr>
-                <w:rFonts w:ascii="Tahoma" w:hAnsi="Tahoma" w:cs="Tahoma"/>
-                <w:color w:val="000000" w:themeColor="text1"/>
-                <w:sz w:val="16"/>
-                <w:szCs w:val="16"/>
-              </w:rPr>
-              <w:t>"glit_id":164807,"user_id":68793,"user_screen_name":"lorem_ipsum","id</w:t>
-            </w:r>
-            <w:proofErr w:type="gramStart"/>
-            <w:r>
-              <w:rPr>
-                <w:rFonts w:ascii="Tahoma" w:hAnsi="Tahoma" w:cs="Tahoma"/>
-                <w:color w:val="000000" w:themeColor="text1"/>
-                <w:sz w:val="16"/>
-                <w:szCs w:val="16"/>
-              </w:rPr>
-              <w:t>":-</w:t>
-            </w:r>
-            <w:proofErr w:type="gramEnd"/>
-            <w:r>
-              <w:rPr>
-                <w:rFonts w:ascii="Tahoma" w:hAnsi="Tahoma" w:cs="Tahoma"/>
-                <w:color w:val="000000" w:themeColor="text1"/>
-                <w:sz w:val="16"/>
-                <w:szCs w:val="16"/>
-              </w:rPr>
-              <w:t>1,"content":"lorem_ipsum","date":"2026-09-26T00:09:22.109197Z</w:t>
-            </w:r>
-            <w:proofErr w:type="gramStart"/>
-            <w:r>
-              <w:rPr>
-                <w:rFonts w:ascii="Tahoma" w:hAnsi="Tahoma" w:cs="Tahoma"/>
-                <w:color w:val="000000" w:themeColor="text1"/>
-                <w:sz w:val="16"/>
-                <w:szCs w:val="16"/>
-              </w:rPr>
-              <w:t>"}#</w:t>
-            </w:r>
-            <w:proofErr w:type="gramEnd"/>
-            <w:r>
-              <w:rPr>
-                <w:rFonts w:ascii="Tahoma" w:hAnsi="Tahoma" w:cs="Tahoma"/>
-                <w:color w:val="000000" w:themeColor="text1"/>
-                <w:sz w:val="16"/>
-                <w:szCs w:val="16"/>
-              </w:rPr>
-              <w:t>#</w:t>
+              <w:t>650#{gli&amp;&amp;er}{"glit_id":164807,"user_id":68793,"user_screen_name":"lorem_ipsum","id":-1,"content":"lorem_ipsum","date":"2026-09-26T00:09:22.109197Z"}##</w:t>
             </w:r>
           </w:p>
         </w:tc>
@@ -12296,33 +11923,7 @@
                 <w:szCs w:val="24"/>
                 <w:rtl/>
               </w:rPr>
-              <w:t xml:space="preserve"> </w:t>
-            </w:r>
-            <w:proofErr w:type="spellStart"/>
-            <w:r>
-              <w:rPr>
-                <w:rFonts w:ascii="Tahoma" w:hAnsi="Tahoma" w:cs="Tahoma" w:hint="cs"/>
-                <w:b/>
-                <w:bCs/>
-                <w:color w:val="FFFFFF" w:themeColor="background1"/>
-                <w:sz w:val="24"/>
-                <w:szCs w:val="24"/>
-                <w:rtl/>
-              </w:rPr>
-              <w:t>לנק</w:t>
-            </w:r>
-            <w:proofErr w:type="spellEnd"/>
-            <w:r>
-              <w:rPr>
-                <w:rFonts w:ascii="Tahoma" w:hAnsi="Tahoma" w:cs="Tahoma" w:hint="cs"/>
-                <w:b/>
-                <w:bCs/>
-                <w:color w:val="FFFFFF" w:themeColor="background1"/>
-                <w:sz w:val="24"/>
-                <w:szCs w:val="24"/>
-                <w:rtl/>
-              </w:rPr>
-              <w:t>' כניסה</w:t>
+              <w:t xml:space="preserve"> לנק' כניסה</w:t>
             </w:r>
           </w:p>
           <w:p>
@@ -14295,47 +13896,7 @@
                 <w:sz w:val="16"/>
                 <w:szCs w:val="16"/>
               </w:rPr>
-              <w:t>750#{gli&amp;&amp;</w:t>
-            </w:r>
-            <w:proofErr w:type="gramStart"/>
-            <w:r>
-              <w:rPr>
-                <w:rFonts w:ascii="Tahoma" w:hAnsi="Tahoma" w:cs="Tahoma"/>
-                <w:color w:val="000000" w:themeColor="text1"/>
-                <w:sz w:val="16"/>
-                <w:szCs w:val="16"/>
-              </w:rPr>
-              <w:t>er}{</w:t>
-            </w:r>
-            <w:proofErr w:type="gramEnd"/>
-            <w:r>
-              <w:rPr>
-                <w:rFonts w:ascii="Tahoma" w:hAnsi="Tahoma" w:cs="Tahoma"/>
-                <w:color w:val="000000" w:themeColor="text1"/>
-                <w:sz w:val="16"/>
-                <w:szCs w:val="16"/>
-              </w:rPr>
-              <w:t>"user_id":68793,"user_screen_name":"lorem_ipsum","glit_id":</w:t>
-            </w:r>
-            <w:proofErr w:type="gramStart"/>
-            <w:r>
-              <w:rPr>
-                <w:rFonts w:ascii="Tahoma" w:hAnsi="Tahoma" w:cs="Tahoma"/>
-                <w:color w:val="000000" w:themeColor="text1"/>
-                <w:sz w:val="16"/>
-                <w:szCs w:val="16"/>
-              </w:rPr>
-              <w:t>164807}#</w:t>
-            </w:r>
-            <w:proofErr w:type="gramEnd"/>
-            <w:r>
-              <w:rPr>
-                <w:rFonts w:ascii="Tahoma" w:hAnsi="Tahoma" w:cs="Tahoma"/>
-                <w:color w:val="000000" w:themeColor="text1"/>
-                <w:sz w:val="16"/>
-                <w:szCs w:val="16"/>
-              </w:rPr>
-              <w:t>#</w:t>
+              <w:t>750#{gli&amp;&amp;er}{"user_id":68793,"user_screen_name":"lorem_ipsum","glit_id":164807}##</w:t>
             </w:r>
           </w:p>
         </w:tc>
@@ -14826,27 +14387,7 @@
                 <w:sz w:val="16"/>
                 <w:szCs w:val="16"/>
               </w:rPr>
-              <w:t xml:space="preserve">Wow </w:t>
-            </w:r>
-            <w:proofErr w:type="spellStart"/>
-            <w:r>
-              <w:rPr>
-                <w:rFonts w:ascii="Tahoma" w:hAnsi="Tahoma" w:cs="Tahoma"/>
-                <w:color w:val="000000" w:themeColor="text1"/>
-                <w:sz w:val="16"/>
-                <w:szCs w:val="16"/>
-              </w:rPr>
-              <w:t>pulish</w:t>
-            </w:r>
-            <w:proofErr w:type="spellEnd"/>
-            <w:r>
-              <w:rPr>
-                <w:rFonts w:ascii="Tahoma" w:hAnsi="Tahoma" w:cs="Tahoma"/>
-                <w:color w:val="000000" w:themeColor="text1"/>
-                <w:sz w:val="16"/>
-                <w:szCs w:val="16"/>
-              </w:rPr>
-              <w:t xml:space="preserve"> approved{gli&amp;&amp;er}{"glit_id":164807,"user_id":68793,"user_screen_name":"lorem_ipsum","id":14334,"date":"2026-09-25T21:12:02.857Z"}</w:t>
+              <w:t>Wow pulish approved{gli&amp;&amp;er}{"glit_id":164807,"user_id":68793,"user_screen_name":"lorem_ipsum","id":14334,"date":"2026-09-25T21:12:02.857Z"}</w:t>
             </w:r>
             <w:r>
               <w:rPr>
@@ -14910,33 +14451,7 @@
                 <w:szCs w:val="24"/>
                 <w:rtl/>
               </w:rPr>
-              <w:t xml:space="preserve"> </w:t>
-            </w:r>
-            <w:proofErr w:type="spellStart"/>
-            <w:r>
-              <w:rPr>
-                <w:rFonts w:ascii="Tahoma" w:hAnsi="Tahoma" w:cs="Tahoma" w:hint="cs"/>
-                <w:b/>
-                <w:bCs/>
-                <w:color w:val="FFFFFF" w:themeColor="background1"/>
-                <w:sz w:val="24"/>
-                <w:szCs w:val="24"/>
-                <w:rtl/>
-              </w:rPr>
-              <w:t>לנק</w:t>
-            </w:r>
-            <w:proofErr w:type="spellEnd"/>
-            <w:r>
-              <w:rPr>
-                <w:rFonts w:ascii="Tahoma" w:hAnsi="Tahoma" w:cs="Tahoma" w:hint="cs"/>
-                <w:b/>
-                <w:bCs/>
-                <w:color w:val="FFFFFF" w:themeColor="background1"/>
-                <w:sz w:val="24"/>
-                <w:szCs w:val="24"/>
-                <w:rtl/>
-              </w:rPr>
-              <w:t>' כניסה</w:t>
+              <w:t xml:space="preserve"> לנק' כניסה</w:t>
             </w:r>
           </w:p>
           <w:p>
@@ -16462,18 +15977,8 @@
                 <w:color w:val="000000" w:themeColor="text1"/>
                 <w:rtl/>
               </w:rPr>
-              <w:t xml:space="preserve"> </w:t>
-            </w:r>
-            <w:proofErr w:type="spellStart"/>
-            <w:r>
-              <w:rPr>
-                <w:rFonts w:ascii="Tahoma" w:hAnsi="Tahoma" w:cs="Tahoma" w:hint="cs"/>
-                <w:color w:val="000000" w:themeColor="text1"/>
-                <w:rtl/>
-              </w:rPr>
-              <w:t>בפיד</w:t>
-            </w:r>
-            <w:proofErr w:type="spellEnd"/>
+              <w:t xml:space="preserve"> בפיד</w:t>
+            </w:r>
           </w:p>
         </w:tc>
       </w:tr>
@@ -16611,7 +16116,6 @@
                 <w:rFonts w:ascii="Tahoma" w:hAnsi="Tahoma" w:cs="Tahoma"/>
               </w:rPr>
             </w:pPr>
-            <w:proofErr w:type="spellStart"/>
             <w:r>
               <w:rPr>
                 <w:rFonts w:ascii="Tahoma" w:hAnsi="Tahoma" w:cs="Tahoma"/>
@@ -16620,7 +16124,6 @@
               </w:rPr>
               <w:t>feed_owner_id</w:t>
             </w:r>
-            <w:proofErr w:type="spellEnd"/>
           </w:p>
         </w:tc>
         <w:tc>
@@ -16731,7 +16234,6 @@
                 <w:rFonts w:ascii="Tahoma" w:hAnsi="Tahoma" w:cs="Tahoma"/>
               </w:rPr>
             </w:pPr>
-            <w:proofErr w:type="spellStart"/>
             <w:r>
               <w:rPr>
                 <w:rFonts w:ascii="Tahoma" w:hAnsi="Tahoma" w:cs="Tahoma"/>
@@ -16740,7 +16242,6 @@
               </w:rPr>
               <w:t>publisher_id</w:t>
             </w:r>
-            <w:proofErr w:type="spellEnd"/>
           </w:p>
         </w:tc>
         <w:tc>
@@ -16821,7 +16322,6 @@
                 <w:rFonts w:ascii="Tahoma" w:hAnsi="Tahoma" w:cs="Tahoma"/>
               </w:rPr>
             </w:pPr>
-            <w:proofErr w:type="spellStart"/>
             <w:r>
               <w:rPr>
                 <w:rFonts w:ascii="Tahoma" w:hAnsi="Tahoma" w:cs="Tahoma"/>
@@ -16830,7 +16330,6 @@
               </w:rPr>
               <w:t>publisher_screen_name</w:t>
             </w:r>
-            <w:proofErr w:type="spellEnd"/>
           </w:p>
         </w:tc>
         <w:tc>
@@ -16931,7 +16430,6 @@
                 <w:rFonts w:ascii="Tahoma" w:hAnsi="Tahoma" w:cs="Tahoma"/>
               </w:rPr>
             </w:pPr>
-            <w:proofErr w:type="spellStart"/>
             <w:r>
               <w:rPr>
                 <w:rFonts w:ascii="Tahoma" w:hAnsi="Tahoma" w:cs="Tahoma"/>
@@ -16940,7 +16438,6 @@
               </w:rPr>
               <w:t>publisher_avatar</w:t>
             </w:r>
-            <w:proofErr w:type="spellEnd"/>
           </w:p>
         </w:tc>
         <w:tc>
@@ -17031,7 +16528,6 @@
                 <w:rFonts w:ascii="Tahoma" w:hAnsi="Tahoma" w:cs="Tahoma"/>
               </w:rPr>
             </w:pPr>
-            <w:proofErr w:type="spellStart"/>
             <w:r>
               <w:rPr>
                 <w:rFonts w:ascii="Tahoma" w:hAnsi="Tahoma" w:cs="Tahoma"/>
@@ -17040,7 +16536,6 @@
               </w:rPr>
               <w:t>background_color</w:t>
             </w:r>
-            <w:proofErr w:type="spellEnd"/>
           </w:p>
         </w:tc>
         <w:tc>
@@ -17267,7 +16762,6 @@
                 <w:rFonts w:ascii="Tahoma" w:hAnsi="Tahoma" w:cs="Tahoma"/>
               </w:rPr>
             </w:pPr>
-            <w:proofErr w:type="spellStart"/>
             <w:r>
               <w:rPr>
                 <w:rFonts w:ascii="Tahoma" w:hAnsi="Tahoma" w:cs="Tahoma"/>
@@ -17276,7 +16770,6 @@
               </w:rPr>
               <w:t>font_color</w:t>
             </w:r>
-            <w:proofErr w:type="spellEnd"/>
           </w:p>
         </w:tc>
         <w:tc>
@@ -17472,69 +16965,32 @@
                 <w:sz w:val="16"/>
                 <w:szCs w:val="16"/>
               </w:rPr>
-              <w:t>555#Glit publish approved{gli&amp;&amp;</w:t>
-            </w:r>
-            <w:proofErr w:type="gramStart"/>
+              <w:t>555#Glit publish approved{gli&amp;&amp;er}{"feed_owner_id":68793,"publisher_id":68793,"publisher_screen_name":"lorem_ipsum","publisher_avatar":"im</w:t>
+            </w:r>
             <w:r>
               <w:rPr>
                 <w:rFonts w:ascii="Tahoma" w:hAnsi="Tahoma" w:cs="Tahoma"/>
                 <w:sz w:val="16"/>
                 <w:szCs w:val="16"/>
               </w:rPr>
-              <w:t>er}{</w:t>
-            </w:r>
-            <w:proofErr w:type="gramEnd"/>
+              <w:t>4</w:t>
+            </w:r>
             <w:r>
               <w:rPr>
                 <w:rFonts w:ascii="Tahoma" w:hAnsi="Tahoma" w:cs="Tahoma"/>
                 <w:sz w:val="16"/>
                 <w:szCs w:val="16"/>
               </w:rPr>
-              <w:t>"feed_owner_id":68793,"publisher_id":68793,"publisher_screen_name":"lorem_ipsum","publisher_avatar":"im</w:t>
+              <w:t>","background_color":"OrangeRed","date":"2026-09-26T00:19:58.903702Z","content":"lorem_ipsum","font_color":"black","id":164811}</w:t>
             </w:r>
             <w:r>
               <w:rPr>
                 <w:rFonts w:ascii="Tahoma" w:hAnsi="Tahoma" w:cs="Tahoma"/>
                 <w:sz w:val="16"/>
                 <w:szCs w:val="16"/>
-              </w:rPr>
-              <w:t>4</w:t>
-            </w:r>
-            <w:r>
-              <w:rPr>
-                <w:rFonts w:ascii="Tahoma" w:hAnsi="Tahoma" w:cs="Tahoma"/>
-                <w:sz w:val="16"/>
-                <w:szCs w:val="16"/>
-              </w:rPr>
-              <w:t>","background_color":"OrangeRed","date":"2026-09-26T00:19:58.903702Z","content":"lorem_ipsum","font_color":"black","id":</w:t>
-            </w:r>
-            <w:proofErr w:type="gramStart"/>
-            <w:r>
-              <w:rPr>
-                <w:rFonts w:ascii="Tahoma" w:hAnsi="Tahoma" w:cs="Tahoma"/>
-                <w:sz w:val="16"/>
-                <w:szCs w:val="16"/>
-              </w:rPr>
-              <w:t>164811}</w:t>
-            </w:r>
-            <w:r>
-              <w:rPr>
-                <w:rFonts w:ascii="Tahoma" w:hAnsi="Tahoma" w:cs="Tahoma"/>
-                <w:sz w:val="16"/>
-                <w:szCs w:val="16"/>
-                <w:rtl/>
-              </w:rPr>
-              <w:t>#</w:t>
-            </w:r>
-            <w:proofErr w:type="gramEnd"/>
-            <w:r>
-              <w:rPr>
-                <w:rFonts w:ascii="Tahoma" w:hAnsi="Tahoma" w:cs="Tahoma"/>
-                <w:sz w:val="16"/>
-                <w:szCs w:val="16"/>
-                <w:rtl/>
-              </w:rPr>
-              <w:t>#</w:t>
+                <w:rtl/>
+              </w:rPr>
+              <w:t>##</w:t>
             </w:r>
           </w:p>
         </w:tc>
@@ -17588,33 +17044,7 @@
                 <w:szCs w:val="24"/>
                 <w:rtl/>
               </w:rPr>
-              <w:t xml:space="preserve"> </w:t>
-            </w:r>
-            <w:proofErr w:type="spellStart"/>
-            <w:r>
-              <w:rPr>
-                <w:rFonts w:ascii="Tahoma" w:hAnsi="Tahoma" w:cs="Tahoma" w:hint="cs"/>
-                <w:b/>
-                <w:bCs/>
-                <w:color w:val="FFFFFF" w:themeColor="background1"/>
-                <w:sz w:val="24"/>
-                <w:szCs w:val="24"/>
-                <w:rtl/>
-              </w:rPr>
-              <w:t>לנק</w:t>
-            </w:r>
-            <w:proofErr w:type="spellEnd"/>
-            <w:r>
-              <w:rPr>
-                <w:rFonts w:ascii="Tahoma" w:hAnsi="Tahoma" w:cs="Tahoma" w:hint="cs"/>
-                <w:b/>
-                <w:bCs/>
-                <w:color w:val="FFFFFF" w:themeColor="background1"/>
-                <w:sz w:val="24"/>
-                <w:szCs w:val="24"/>
-                <w:rtl/>
-              </w:rPr>
-              <w:t>' כניסה</w:t>
+              <w:t xml:space="preserve"> לנק' כניסה</w:t>
             </w:r>
           </w:p>
           <w:p>
@@ -20488,9 +19918,8 @@
                 <w:sz w:val="16"/>
                 <w:szCs w:val="16"/>
               </w:rPr>
-              <w:t>150#{gli&amp;&amp;</w:t>
-            </w:r>
-            <w:proofErr w:type="gramStart"/>
+              <w:t>150#{gli&amp;&amp;er}{"registration_code":"11</w:t>
+            </w:r>
             <w:r>
               <w:rPr>
                 <w:rFonts w:ascii="Tahoma" w:hAnsi="Tahoma" w:cs="Tahoma"/>
@@ -20498,9 +19927,8 @@
                 <w:sz w:val="16"/>
                 <w:szCs w:val="16"/>
               </w:rPr>
-              <w:t>er}{</w:t>
-            </w:r>
-            <w:proofErr w:type="gramEnd"/>
+              <w:t>1</w:t>
+            </w:r>
             <w:r>
               <w:rPr>
                 <w:rFonts w:ascii="Tahoma" w:hAnsi="Tahoma" w:cs="Tahoma"/>
@@ -20508,85 +19936,7 @@
                 <w:sz w:val="16"/>
                 <w:szCs w:val="16"/>
               </w:rPr>
-              <w:t>"registration_code":"11</w:t>
-            </w:r>
-            <w:r>
-              <w:rPr>
-                <w:rFonts w:ascii="Tahoma" w:hAnsi="Tahoma" w:cs="Tahoma"/>
-                <w:color w:val="000000" w:themeColor="text1"/>
-                <w:sz w:val="16"/>
-                <w:szCs w:val="16"/>
-              </w:rPr>
-              <w:t>1</w:t>
-            </w:r>
-            <w:r>
-              <w:rPr>
-                <w:rFonts w:ascii="Tahoma" w:hAnsi="Tahoma" w:cs="Tahoma"/>
-                <w:color w:val="000000" w:themeColor="text1"/>
-                <w:sz w:val="16"/>
-                <w:szCs w:val="16"/>
-              </w:rPr>
-              <w:t>11","user</w:t>
-            </w:r>
-            <w:proofErr w:type="gramStart"/>
-            <w:r>
-              <w:rPr>
-                <w:rFonts w:ascii="Tahoma" w:hAnsi="Tahoma" w:cs="Tahoma"/>
-                <w:color w:val="000000" w:themeColor="text1"/>
-                <w:sz w:val="16"/>
-                <w:szCs w:val="16"/>
-              </w:rPr>
-              <w:t>":{</w:t>
-            </w:r>
-            <w:proofErr w:type="gramEnd"/>
-            <w:r>
-              <w:rPr>
-                <w:rFonts w:ascii="Tahoma" w:hAnsi="Tahoma" w:cs="Tahoma"/>
-                <w:color w:val="000000" w:themeColor="text1"/>
-                <w:sz w:val="16"/>
-                <w:szCs w:val="16"/>
-              </w:rPr>
-              <w:t>"screen_name":"lorem_ipsum","avatar":"im4","description":"lorem_ipsum","privacy":"Public","id</w:t>
-            </w:r>
-            <w:proofErr w:type="gramStart"/>
-            <w:r>
-              <w:rPr>
-                <w:rFonts w:ascii="Tahoma" w:hAnsi="Tahoma" w:cs="Tahoma"/>
-                <w:color w:val="000000" w:themeColor="text1"/>
-                <w:sz w:val="16"/>
-                <w:szCs w:val="16"/>
-              </w:rPr>
-              <w:t>":-</w:t>
-            </w:r>
-            <w:proofErr w:type="gramEnd"/>
-            <w:r>
-              <w:rPr>
-                <w:rFonts w:ascii="Tahoma" w:hAnsi="Tahoma" w:cs="Tahoma"/>
-                <w:color w:val="000000" w:themeColor="text1"/>
-                <w:sz w:val="16"/>
-                <w:szCs w:val="16"/>
-              </w:rPr>
-              <w:t>1,"user_name":"yona5","password":"yona5","gender":"Male","mail":"lorem_ipsum@lorem.ipsum</w:t>
-            </w:r>
-            <w:proofErr w:type="gramStart"/>
-            <w:r>
-              <w:rPr>
-                <w:rFonts w:ascii="Tahoma" w:hAnsi="Tahoma" w:cs="Tahoma"/>
-                <w:color w:val="000000" w:themeColor="text1"/>
-                <w:sz w:val="16"/>
-                <w:szCs w:val="16"/>
-              </w:rPr>
-              <w:t>"}#</w:t>
-            </w:r>
-            <w:proofErr w:type="gramEnd"/>
-            <w:r>
-              <w:rPr>
-                <w:rFonts w:ascii="Tahoma" w:hAnsi="Tahoma" w:cs="Tahoma"/>
-                <w:color w:val="000000" w:themeColor="text1"/>
-                <w:sz w:val="16"/>
-                <w:szCs w:val="16"/>
-              </w:rPr>
-              <w:t>#</w:t>
+              <w:t>11","user":{"screen_name":"lorem_ipsum","avatar":"im4","description":"lorem_ipsum","privacy":"Public","id":-1,"user_name":"yona5","password":"yona5","gender":"Male","mail":"lorem_ipsum@lorem.ipsum"}##</w:t>
             </w:r>
           </w:p>
         </w:tc>
@@ -20790,7 +20140,6 @@
                 <w:color w:val="000000" w:themeColor="text1"/>
               </w:rPr>
             </w:pPr>
-            <w:proofErr w:type="spellStart"/>
             <w:r>
               <w:rPr>
                 <w:rFonts w:ascii="Tahoma" w:hAnsi="Tahoma" w:cs="Tahoma"/>
@@ -20798,7 +20147,6 @@
               </w:rPr>
               <w:t>registration_code</w:t>
             </w:r>
-            <w:proofErr w:type="spellEnd"/>
           </w:p>
         </w:tc>
         <w:tc>
@@ -20904,7 +20252,6 @@
                 <w:color w:val="000000" w:themeColor="text1"/>
               </w:rPr>
             </w:pPr>
-            <w:proofErr w:type="spellStart"/>
             <w:r>
               <w:rPr>
                 <w:rFonts w:ascii="Tahoma" w:hAnsi="Tahoma" w:cs="Tahoma"/>
@@ -20913,7 +20260,6 @@
               </w:rPr>
               <w:t>screen_name</w:t>
             </w:r>
-            <w:proofErr w:type="spellEnd"/>
           </w:p>
         </w:tc>
         <w:tc>
@@ -21383,7 +20729,6 @@
                 <w:color w:val="000000" w:themeColor="text1"/>
               </w:rPr>
             </w:pPr>
-            <w:proofErr w:type="spellStart"/>
             <w:r>
               <w:rPr>
                 <w:rFonts w:ascii="Tahoma" w:hAnsi="Tahoma" w:cs="Tahoma"/>
@@ -21392,7 +20737,6 @@
               </w:rPr>
               <w:t>user_name</w:t>
             </w:r>
-            <w:proofErr w:type="spellEnd"/>
           </w:p>
         </w:tc>
         <w:tc>
@@ -21818,33 +21162,7 @@
                 <w:szCs w:val="24"/>
                 <w:rtl/>
               </w:rPr>
-              <w:t xml:space="preserve"> </w:t>
-            </w:r>
-            <w:proofErr w:type="spellStart"/>
-            <w:r>
-              <w:rPr>
-                <w:rFonts w:ascii="Tahoma" w:hAnsi="Tahoma" w:cs="Tahoma" w:hint="cs"/>
-                <w:b/>
-                <w:bCs/>
-                <w:color w:val="FFFFFF" w:themeColor="background1"/>
-                <w:sz w:val="24"/>
-                <w:szCs w:val="24"/>
-                <w:rtl/>
-              </w:rPr>
-              <w:t>לנק</w:t>
-            </w:r>
-            <w:proofErr w:type="spellEnd"/>
-            <w:r>
-              <w:rPr>
-                <w:rFonts w:ascii="Tahoma" w:hAnsi="Tahoma" w:cs="Tahoma" w:hint="cs"/>
-                <w:b/>
-                <w:bCs/>
-                <w:color w:val="FFFFFF" w:themeColor="background1"/>
-                <w:sz w:val="24"/>
-                <w:szCs w:val="24"/>
-                <w:rtl/>
-              </w:rPr>
-              <w:t>' כניסה</w:t>
+              <w:t xml:space="preserve"> לנק' כניסה</w:t>
             </w:r>
           </w:p>
           <w:p>
@@ -24169,207 +23487,7 @@
                 <w:sz w:val="16"/>
                 <w:szCs w:val="16"/>
               </w:rPr>
-              <w:t>Entities search result{</w:t>
-            </w:r>
-            <w:proofErr w:type="spellStart"/>
-            <w:r>
-              <w:rPr>
-                <w:rFonts w:ascii="Tahoma" w:hAnsi="Tahoma" w:cs="Tahoma"/>
-                <w:color w:val="000000" w:themeColor="text1"/>
-                <w:sz w:val="16"/>
-                <w:szCs w:val="16"/>
-              </w:rPr>
-              <w:t>gli</w:t>
-            </w:r>
-            <w:proofErr w:type="spellEnd"/>
-            <w:r>
-              <w:rPr>
-                <w:rFonts w:ascii="Tahoma" w:hAnsi="Tahoma" w:cs="Tahoma"/>
-                <w:color w:val="000000" w:themeColor="text1"/>
-                <w:sz w:val="16"/>
-                <w:szCs w:val="16"/>
-              </w:rPr>
-              <w:t>&amp;&amp;er}[{"</w:t>
-            </w:r>
-            <w:proofErr w:type="spellStart"/>
-            <w:r>
-              <w:rPr>
-                <w:rFonts w:ascii="Tahoma" w:hAnsi="Tahoma" w:cs="Tahoma"/>
-                <w:color w:val="000000" w:themeColor="text1"/>
-                <w:sz w:val="16"/>
-                <w:szCs w:val="16"/>
-              </w:rPr>
-              <w:t>screen_name":"Lorem</w:t>
-            </w:r>
-            <w:proofErr w:type="spellEnd"/>
-            <w:r>
-              <w:rPr>
-                <w:rFonts w:ascii="Tahoma" w:hAnsi="Tahoma" w:cs="Tahoma"/>
-                <w:color w:val="000000" w:themeColor="text1"/>
-                <w:sz w:val="16"/>
-                <w:szCs w:val="16"/>
-              </w:rPr>
-              <w:t xml:space="preserve"> ipsum dolor sit </w:t>
-            </w:r>
-            <w:proofErr w:type="spellStart"/>
-            <w:r>
-              <w:rPr>
-                <w:rFonts w:ascii="Tahoma" w:hAnsi="Tahoma" w:cs="Tahoma"/>
-                <w:color w:val="000000" w:themeColor="text1"/>
-                <w:sz w:val="16"/>
-                <w:szCs w:val="16"/>
-              </w:rPr>
-              <w:t>amet</w:t>
-            </w:r>
-            <w:proofErr w:type="spellEnd"/>
-            <w:r>
-              <w:rPr>
-                <w:rFonts w:ascii="Tahoma" w:hAnsi="Tahoma" w:cs="Tahoma"/>
-                <w:color w:val="000000" w:themeColor="text1"/>
-                <w:sz w:val="16"/>
-                <w:szCs w:val="16"/>
-              </w:rPr>
-              <w:t xml:space="preserve">, </w:t>
-            </w:r>
-            <w:proofErr w:type="spellStart"/>
-            <w:r>
-              <w:rPr>
-                <w:rFonts w:ascii="Tahoma" w:hAnsi="Tahoma" w:cs="Tahoma"/>
-                <w:color w:val="000000" w:themeColor="text1"/>
-                <w:sz w:val="16"/>
-                <w:szCs w:val="16"/>
-              </w:rPr>
-              <w:t>consectetur</w:t>
-            </w:r>
-            <w:proofErr w:type="spellEnd"/>
-            <w:r>
-              <w:rPr>
-                <w:rFonts w:ascii="Tahoma" w:hAnsi="Tahoma" w:cs="Tahoma"/>
-                <w:color w:val="000000" w:themeColor="text1"/>
-                <w:sz w:val="16"/>
-                <w:szCs w:val="16"/>
-              </w:rPr>
-              <w:t xml:space="preserve"> </w:t>
-            </w:r>
-            <w:proofErr w:type="spellStart"/>
-            <w:r>
-              <w:rPr>
-                <w:rFonts w:ascii="Tahoma" w:hAnsi="Tahoma" w:cs="Tahoma"/>
-                <w:color w:val="000000" w:themeColor="text1"/>
-                <w:sz w:val="16"/>
-                <w:szCs w:val="16"/>
-              </w:rPr>
-              <w:t>adipiscing</w:t>
-            </w:r>
-            <w:proofErr w:type="spellEnd"/>
-            <w:r>
-              <w:rPr>
-                <w:rFonts w:ascii="Tahoma" w:hAnsi="Tahoma" w:cs="Tahoma"/>
-                <w:color w:val="000000" w:themeColor="text1"/>
-                <w:sz w:val="16"/>
-                <w:szCs w:val="16"/>
-              </w:rPr>
-              <w:t xml:space="preserve"> </w:t>
-            </w:r>
-            <w:proofErr w:type="spellStart"/>
-            <w:r>
-              <w:rPr>
-                <w:rFonts w:ascii="Tahoma" w:hAnsi="Tahoma" w:cs="Tahoma"/>
-                <w:color w:val="000000" w:themeColor="text1"/>
-                <w:sz w:val="16"/>
-                <w:szCs w:val="16"/>
-              </w:rPr>
-              <w:t>elit</w:t>
-            </w:r>
-            <w:proofErr w:type="spellEnd"/>
-            <w:r>
-              <w:rPr>
-                <w:rFonts w:ascii="Tahoma" w:hAnsi="Tahoma" w:cs="Tahoma"/>
-                <w:color w:val="000000" w:themeColor="text1"/>
-                <w:sz w:val="16"/>
-                <w:szCs w:val="16"/>
-              </w:rPr>
-              <w:t xml:space="preserve">. Sed do </w:t>
-            </w:r>
-            <w:proofErr w:type="spellStart"/>
-            <w:r>
-              <w:rPr>
-                <w:rFonts w:ascii="Tahoma" w:hAnsi="Tahoma" w:cs="Tahoma"/>
-                <w:color w:val="000000" w:themeColor="text1"/>
-                <w:sz w:val="16"/>
-                <w:szCs w:val="16"/>
-              </w:rPr>
-              <w:t>eiusmod</w:t>
-            </w:r>
-            <w:proofErr w:type="spellEnd"/>
-            <w:r>
-              <w:rPr>
-                <w:rFonts w:ascii="Tahoma" w:hAnsi="Tahoma" w:cs="Tahoma"/>
-                <w:color w:val="000000" w:themeColor="text1"/>
-                <w:sz w:val="16"/>
-                <w:szCs w:val="16"/>
-              </w:rPr>
-              <w:t xml:space="preserve"> </w:t>
-            </w:r>
-            <w:proofErr w:type="spellStart"/>
-            <w:r>
-              <w:rPr>
-                <w:rFonts w:ascii="Tahoma" w:hAnsi="Tahoma" w:cs="Tahoma"/>
-                <w:color w:val="000000" w:themeColor="text1"/>
-                <w:sz w:val="16"/>
-                <w:szCs w:val="16"/>
-              </w:rPr>
-              <w:t>tempor</w:t>
-            </w:r>
-            <w:proofErr w:type="spellEnd"/>
-            <w:r>
-              <w:rPr>
-                <w:rFonts w:ascii="Tahoma" w:hAnsi="Tahoma" w:cs="Tahoma"/>
-                <w:color w:val="000000" w:themeColor="text1"/>
-                <w:sz w:val="16"/>
-                <w:szCs w:val="16"/>
-              </w:rPr>
-              <w:t xml:space="preserve"> </w:t>
-            </w:r>
-            <w:proofErr w:type="spellStart"/>
-            <w:r>
-              <w:rPr>
-                <w:rFonts w:ascii="Tahoma" w:hAnsi="Tahoma" w:cs="Tahoma"/>
-                <w:color w:val="000000" w:themeColor="text1"/>
-                <w:sz w:val="16"/>
-                <w:szCs w:val="16"/>
-              </w:rPr>
-              <w:t>incididunt</w:t>
-            </w:r>
-            <w:proofErr w:type="spellEnd"/>
-            <w:r>
-              <w:rPr>
-                <w:rFonts w:ascii="Tahoma" w:hAnsi="Tahoma" w:cs="Tahoma"/>
-                <w:color w:val="000000" w:themeColor="text1"/>
-                <w:sz w:val="16"/>
-                <w:szCs w:val="16"/>
-              </w:rPr>
-              <w:t xml:space="preserve"> </w:t>
-            </w:r>
-            <w:proofErr w:type="spellStart"/>
-            <w:r>
-              <w:rPr>
-                <w:rFonts w:ascii="Tahoma" w:hAnsi="Tahoma" w:cs="Tahoma"/>
-                <w:color w:val="000000" w:themeColor="text1"/>
-                <w:sz w:val="16"/>
-                <w:szCs w:val="16"/>
-              </w:rPr>
-              <w:t>ut</w:t>
-            </w:r>
-            <w:proofErr w:type="spellEnd"/>
-            <w:r>
-              <w:rPr>
-                <w:rFonts w:ascii="Tahoma" w:hAnsi="Tahoma" w:cs="Tahoma"/>
-                <w:color w:val="000000" w:themeColor="text1"/>
-                <w:sz w:val="16"/>
-                <w:szCs w:val="16"/>
-              </w:rPr>
-              <w:t xml:space="preserve"> labore ","avatar":"im7","description":"asd","privacy":"Private","id":42982,"mail":"ssasd@gmail.com</w:t>
+              <w:t>Entities search result{gli&amp;&amp;er}[{"screen_name":"Lorem ipsum dolor sit amet, consectetur adipiscing elit. Sed do eiusmod tempor incididunt ut labore ","avatar":"im7","description":"asd","privacy":"Private","id":42982,"mail":"ssasd@gmail.com</w:t>
             </w:r>
             <w:r>
               <w:rPr>
@@ -24432,33 +23550,7 @@
                 <w:szCs w:val="24"/>
                 <w:rtl/>
               </w:rPr>
-              <w:t xml:space="preserve"> </w:t>
-            </w:r>
-            <w:proofErr w:type="spellStart"/>
-            <w:r>
-              <w:rPr>
-                <w:rFonts w:ascii="Tahoma" w:hAnsi="Tahoma" w:cs="Tahoma" w:hint="cs"/>
-                <w:b/>
-                <w:bCs/>
-                <w:color w:val="FFFFFF" w:themeColor="background1"/>
-                <w:sz w:val="24"/>
-                <w:szCs w:val="24"/>
-                <w:rtl/>
-              </w:rPr>
-              <w:t>לנק</w:t>
-            </w:r>
-            <w:proofErr w:type="spellEnd"/>
-            <w:r>
-              <w:rPr>
-                <w:rFonts w:ascii="Tahoma" w:hAnsi="Tahoma" w:cs="Tahoma" w:hint="cs"/>
-                <w:b/>
-                <w:bCs/>
-                <w:color w:val="FFFFFF" w:themeColor="background1"/>
-                <w:sz w:val="24"/>
-                <w:szCs w:val="24"/>
-                <w:rtl/>
-              </w:rPr>
-              <w:t>' כניסה</w:t>
+              <w:t xml:space="preserve"> לנק' כניסה</w:t>
             </w:r>
           </w:p>
           <w:p>
@@ -24973,6 +24065,160 @@
           </w:p>
         </w:tc>
       </w:tr>
+      <w:tr>
+        <w:trPr>
+          <w:trHeight w:val="200"/>
+        </w:trPr>
+        <w:tc>
+          <w:tcPr>
+            <w:tcW w:w="6933" w:type="dxa"/>
+            <w:gridSpan w:val="3"/>
+            <w:shd w:val="clear" w:color="auto" w:fill="E7E6E6" w:themeFill="background2"/>
+          </w:tcPr>
+          <w:p>
+            <w:pPr>
+              <w:bidi/>
+              <w:spacing w:line="312" w:lineRule="auto"/>
+              <w:rPr>
+                <w:rFonts w:ascii="Tahoma" w:hAnsi="Tahoma" w:cs="Tahoma" w:hint="cs"/>
+                <w:color w:val="000000" w:themeColor="text1"/>
+                <w:sz w:val="20"/>
+                <w:szCs w:val="20"/>
+                <w:rtl/>
+              </w:rPr>
+            </w:pPr>
+            <w:r>
+              <w:rPr>
+                <w:rFonts w:ascii="Tahoma" w:hAnsi="Tahoma" w:cs="Tahoma" w:hint="cs"/>
+                <w:color w:val="000000" w:themeColor="text1"/>
+                <w:sz w:val="20"/>
+                <w:szCs w:val="20"/>
+                <w:rtl/>
+              </w:rPr>
+              <w:t xml:space="preserve">ביצוע </w:t>
+            </w:r>
+            <w:r>
+              <w:rPr>
+                <w:rFonts w:ascii="Tahoma" w:hAnsi="Tahoma" w:cs="Tahoma"/>
+                <w:color w:val="000000" w:themeColor="text1"/>
+                <w:sz w:val="20"/>
+                <w:szCs w:val="20"/>
+              </w:rPr>
+              <w:t xml:space="preserve">SQL </w:t>
+            </w:r>
+            <w:r>
+              <w:rPr>
+                <w:rFonts w:ascii="Tahoma" w:hAnsi="Tahoma" w:cs="Tahoma"/>
+                <w:color w:val="000000" w:themeColor="text1"/>
+                <w:sz w:val="20"/>
+                <w:szCs w:val="20"/>
+              </w:rPr>
+              <w:t>Injection</w:t>
+            </w:r>
+            <w:r>
+              <w:rPr>
+                <w:rFonts w:ascii="Tahoma" w:hAnsi="Tahoma" w:cs="Tahoma" w:hint="cs"/>
+                <w:color w:val="000000" w:themeColor="text1"/>
+                <w:sz w:val="20"/>
+                <w:szCs w:val="20"/>
+                <w:rtl/>
+              </w:rPr>
+              <w:t xml:space="preserve"> בשדה ערך החיפוש של בקשת החיפוש.</w:t>
+            </w:r>
+          </w:p>
+        </w:tc>
+        <w:sdt>
+          <w:sdtPr>
+            <w:rPr>
+              <w:rFonts w:ascii="Tahoma" w:hAnsi="Tahoma" w:cs="Tahoma" w:hint="cs"/>
+              <w:b/>
+              <w:bCs/>
+              <w:color w:val="000000" w:themeColor="text1"/>
+              <w:sz w:val="18"/>
+              <w:szCs w:val="18"/>
+            </w:rPr>
+            <w:id w:val="430935147"/>
+            <w:placeholder>
+              <w:docPart w:val="6EB4E93FAEFD4BDB8C7E64A73C2D3905"/>
+            </w:placeholder>
+            <w15:color w:val="CCFFFF"/>
+            <w:dropDownList>
+              <w:listItem w:value="בחר/י"/>
+              <w:listItem w:displayText="Spoofing" w:value="Spoofing"/>
+              <w:listItem w:displayText="Tampring" w:value="Tampring"/>
+              <w:listItem w:displayText="Information Disclosure" w:value="Information Disclosure"/>
+              <w:listItem w:displayText="Other" w:value="Other"/>
+            </w:dropDownList>
+          </w:sdtPr>
+          <w:sdtContent>
+            <w:tc>
+              <w:tcPr>
+                <w:tcW w:w="2337" w:type="dxa"/>
+                <w:shd w:val="clear" w:color="auto" w:fill="E7E6E6" w:themeFill="background2"/>
+              </w:tcPr>
+              <w:p>
+                <w:pPr>
+                  <w:spacing w:line="312" w:lineRule="auto"/>
+                  <w:jc w:val="center"/>
+                  <w:rPr>
+                    <w:rFonts w:ascii="Tahoma" w:hAnsi="Tahoma" w:cs="Tahoma"/>
+                    <w:b/>
+                    <w:bCs/>
+                    <w:color w:val="000000" w:themeColor="text1"/>
+                    <w:sz w:val="18"/>
+                    <w:szCs w:val="18"/>
+                  </w:rPr>
+                </w:pPr>
+                <w:r>
+                  <w:rPr>
+                    <w:rFonts w:ascii="Tahoma" w:hAnsi="Tahoma" w:cs="Tahoma" w:hint="cs"/>
+                    <w:b/>
+                    <w:bCs/>
+                    <w:color w:val="000000" w:themeColor="text1"/>
+                    <w:sz w:val="18"/>
+                    <w:szCs w:val="18"/>
+                  </w:rPr>
+                  <w:t>Information Disclosure</w:t>
+                </w:r>
+              </w:p>
+            </w:tc>
+          </w:sdtContent>
+        </w:sdt>
+        <w:tc>
+          <w:tcPr>
+            <w:tcW w:w="1710" w:type="dxa"/>
+            <w:shd w:val="clear" w:color="auto" w:fill="D0CECE" w:themeFill="background2" w:themeFillShade="E6"/>
+          </w:tcPr>
+          <w:p>
+            <w:pPr>
+              <w:bidi/>
+              <w:spacing w:line="312" w:lineRule="auto"/>
+              <w:jc w:val="center"/>
+              <w:rPr>
+                <w:rFonts w:ascii="Tahoma" w:hAnsi="Tahoma" w:cs="Tahoma" w:hint="cs"/>
+                <w:b/>
+                <w:bCs/>
+                <w:color w:val="00B050"/>
+                <w:sz w:val="18"/>
+                <w:szCs w:val="18"/>
+                <w:rtl/>
+              </w:rPr>
+            </w:pPr>
+            <w:r>
+              <w:rPr>
+                <w:rFonts w:ascii="Tahoma" w:hAnsi="Tahoma" w:cs="Tahoma" w:hint="cs"/>
+                <w:b/>
+                <w:bCs/>
+                <w:color w:val="C00000"/>
+                <w:sz w:val="18"/>
+                <w:szCs w:val="18"/>
+                <w:rtl/>
+              </w:rPr>
+              <w:t>לא הצליח</w:t>
+            </w:r>
+          </w:p>
+        </w:tc>
+      </w:tr>
     </w:tbl>
     <w:p>
       <w:pPr>
@@ -25445,7 +24691,6 @@
                 <w:color w:val="000000" w:themeColor="text1"/>
               </w:rPr>
             </w:pPr>
-            <w:proofErr w:type="spellStart"/>
             <w:r>
               <w:rPr>
                 <w:rFonts w:ascii="Tahoma" w:hAnsi="Tahoma" w:cs="Tahoma"/>
@@ -25454,7 +24699,6 @@
               </w:rPr>
               <w:t>screen_name</w:t>
             </w:r>
-            <w:proofErr w:type="spellEnd"/>
           </w:p>
         </w:tc>
         <w:tc>
@@ -25905,7 +25149,6 @@
                 <w:color w:val="000000" w:themeColor="text1"/>
               </w:rPr>
             </w:pPr>
-            <w:proofErr w:type="spellStart"/>
             <w:r>
               <w:rPr>
                 <w:rFonts w:ascii="Tahoma" w:hAnsi="Tahoma" w:cs="Tahoma"/>
@@ -25914,7 +25157,6 @@
               </w:rPr>
               <w:t>user_name</w:t>
             </w:r>
-            <w:proofErr w:type="spellEnd"/>
           </w:p>
         </w:tc>
         <w:tc>
@@ -26342,33 +25584,7 @@
                 <w:szCs w:val="24"/>
                 <w:rtl/>
               </w:rPr>
-              <w:t xml:space="preserve"> </w:t>
-            </w:r>
-            <w:proofErr w:type="spellStart"/>
-            <w:r>
-              <w:rPr>
-                <w:rFonts w:ascii="Tahoma" w:hAnsi="Tahoma" w:cs="Tahoma" w:hint="cs"/>
-                <w:b/>
-                <w:bCs/>
-                <w:color w:val="FFFFFF" w:themeColor="background1"/>
-                <w:sz w:val="24"/>
-                <w:szCs w:val="24"/>
-                <w:rtl/>
-              </w:rPr>
-              <w:t>לנק</w:t>
-            </w:r>
-            <w:proofErr w:type="spellEnd"/>
-            <w:r>
-              <w:rPr>
-                <w:rFonts w:ascii="Tahoma" w:hAnsi="Tahoma" w:cs="Tahoma" w:hint="cs"/>
-                <w:b/>
-                <w:bCs/>
-                <w:color w:val="FFFFFF" w:themeColor="background1"/>
-                <w:sz w:val="24"/>
-                <w:szCs w:val="24"/>
-                <w:rtl/>
-              </w:rPr>
-              <w:t>' כניסה</w:t>
+              <w:t xml:space="preserve"> לנק' כניסה</w:t>
             </w:r>
           </w:p>
           <w:p>
@@ -28336,27 +27552,7 @@
                 <w:sz w:val="16"/>
                 <w:szCs w:val="16"/>
               </w:rPr>
-              <w:t>720#{</w:t>
-            </w:r>
-            <w:proofErr w:type="spellStart"/>
-            <w:r>
-              <w:rPr>
-                <w:rFonts w:ascii="Tahoma" w:hAnsi="Tahoma" w:cs="Tahoma"/>
-                <w:color w:val="000000" w:themeColor="text1"/>
-                <w:sz w:val="16"/>
-                <w:szCs w:val="16"/>
-              </w:rPr>
-              <w:t>gli</w:t>
-            </w:r>
-            <w:proofErr w:type="spellEnd"/>
-            <w:r>
-              <w:rPr>
-                <w:rFonts w:ascii="Tahoma" w:hAnsi="Tahoma" w:cs="Tahoma"/>
-                <w:color w:val="000000" w:themeColor="text1"/>
-                <w:sz w:val="16"/>
-                <w:szCs w:val="16"/>
-              </w:rPr>
-              <w:t>&amp;&amp;er}2150325##</w:t>
+              <w:t>720#{gli&amp;&amp;er}2150325##</w:t>
             </w:r>
           </w:p>
         </w:tc>
@@ -28725,33 +27921,7 @@
                 <w:szCs w:val="24"/>
                 <w:rtl/>
               </w:rPr>
-              <w:t xml:space="preserve"> </w:t>
-            </w:r>
-            <w:proofErr w:type="spellStart"/>
-            <w:r>
-              <w:rPr>
-                <w:rFonts w:ascii="Tahoma" w:hAnsi="Tahoma" w:cs="Tahoma" w:hint="cs"/>
-                <w:b/>
-                <w:bCs/>
-                <w:color w:val="FFFFFF" w:themeColor="background1"/>
-                <w:sz w:val="24"/>
-                <w:szCs w:val="24"/>
-                <w:rtl/>
-              </w:rPr>
-              <w:t>לנק</w:t>
-            </w:r>
-            <w:proofErr w:type="spellEnd"/>
-            <w:r>
-              <w:rPr>
-                <w:rFonts w:ascii="Tahoma" w:hAnsi="Tahoma" w:cs="Tahoma" w:hint="cs"/>
-                <w:b/>
-                <w:bCs/>
-                <w:color w:val="FFFFFF" w:themeColor="background1"/>
-                <w:sz w:val="24"/>
-                <w:szCs w:val="24"/>
-                <w:rtl/>
-              </w:rPr>
-              <w:t>' כניסה</w:t>
+              <w:t xml:space="preserve"> לנק' כניסה</w:t>
             </w:r>
           </w:p>
           <w:p>
@@ -29482,27 +28652,7 @@
                 <w:sz w:val="16"/>
                 <w:szCs w:val="16"/>
               </w:rPr>
-              <w:t>760#{</w:t>
-            </w:r>
-            <w:proofErr w:type="spellStart"/>
-            <w:r>
-              <w:rPr>
-                <w:rFonts w:ascii="Tahoma" w:hAnsi="Tahoma" w:cs="Tahoma"/>
-                <w:color w:val="000000" w:themeColor="text1"/>
-                <w:sz w:val="16"/>
-                <w:szCs w:val="16"/>
-              </w:rPr>
-              <w:t>gli</w:t>
-            </w:r>
-            <w:proofErr w:type="spellEnd"/>
-            <w:r>
-              <w:rPr>
-                <w:rFonts w:ascii="Tahoma" w:hAnsi="Tahoma" w:cs="Tahoma"/>
-                <w:color w:val="000000" w:themeColor="text1"/>
-                <w:sz w:val="16"/>
-                <w:szCs w:val="16"/>
-              </w:rPr>
-              <w:t>&amp;&amp;er}14342##</w:t>
+              <w:t>760#{gli&amp;&amp;er}14342##</w:t>
             </w:r>
           </w:p>
         </w:tc>
@@ -29885,33 +29035,7 @@
                 <w:szCs w:val="24"/>
                 <w:rtl/>
               </w:rPr>
-              <w:t xml:space="preserve"> </w:t>
-            </w:r>
-            <w:proofErr w:type="spellStart"/>
-            <w:r>
-              <w:rPr>
-                <w:rFonts w:ascii="Tahoma" w:hAnsi="Tahoma" w:cs="Tahoma" w:hint="cs"/>
-                <w:b/>
-                <w:bCs/>
-                <w:color w:val="FFFFFF" w:themeColor="background1"/>
-                <w:sz w:val="24"/>
-                <w:szCs w:val="24"/>
-                <w:rtl/>
-              </w:rPr>
-              <w:t>לנק</w:t>
-            </w:r>
-            <w:proofErr w:type="spellEnd"/>
-            <w:r>
-              <w:rPr>
-                <w:rFonts w:ascii="Tahoma" w:hAnsi="Tahoma" w:cs="Tahoma" w:hint="cs"/>
-                <w:b/>
-                <w:bCs/>
-                <w:color w:val="FFFFFF" w:themeColor="background1"/>
-                <w:sz w:val="24"/>
-                <w:szCs w:val="24"/>
-                <w:rtl/>
-              </w:rPr>
-              <w:t>' כניסה</w:t>
+              <w:t xml:space="preserve"> לנק' כניסה</w:t>
             </w:r>
           </w:p>
           <w:p>
@@ -30712,27 +29836,7 @@
                 <w:sz w:val="16"/>
                 <w:szCs w:val="16"/>
               </w:rPr>
-              <w:t>200#{</w:t>
-            </w:r>
-            <w:proofErr w:type="spellStart"/>
-            <w:r>
-              <w:rPr>
-                <w:rFonts w:ascii="Tahoma" w:hAnsi="Tahoma" w:cs="Tahoma"/>
-                <w:color w:val="000000" w:themeColor="text1"/>
-                <w:sz w:val="16"/>
-                <w:szCs w:val="16"/>
-              </w:rPr>
-              <w:t>gli</w:t>
-            </w:r>
-            <w:proofErr w:type="spellEnd"/>
-            <w:r>
-              <w:rPr>
-                <w:rFonts w:ascii="Tahoma" w:hAnsi="Tahoma" w:cs="Tahoma"/>
-                <w:color w:val="000000" w:themeColor="text1"/>
-                <w:sz w:val="16"/>
-                <w:szCs w:val="16"/>
-              </w:rPr>
-              <w:t>&amp;&amp;er}68794##</w:t>
+              <w:t>200#{gli&amp;&amp;er}68794##</w:t>
             </w:r>
           </w:p>
         </w:tc>
@@ -31035,27 +30139,7 @@
                 <w:sz w:val="16"/>
                 <w:szCs w:val="16"/>
               </w:rPr>
-              <w:t>User logout approved{</w:t>
-            </w:r>
-            <w:proofErr w:type="spellStart"/>
-            <w:r>
-              <w:rPr>
-                <w:rFonts w:ascii="Tahoma" w:hAnsi="Tahoma" w:cs="Tahoma"/>
-                <w:color w:val="000000" w:themeColor="text1"/>
-                <w:sz w:val="16"/>
-                <w:szCs w:val="16"/>
-              </w:rPr>
-              <w:t>gli</w:t>
-            </w:r>
-            <w:proofErr w:type="spellEnd"/>
-            <w:r>
-              <w:rPr>
-                <w:rFonts w:ascii="Tahoma" w:hAnsi="Tahoma" w:cs="Tahoma"/>
-                <w:color w:val="000000" w:themeColor="text1"/>
-                <w:sz w:val="16"/>
-                <w:szCs w:val="16"/>
-              </w:rPr>
-              <w:t>&amp;&amp;er}</w:t>
+              <w:t>User logout approved{gli&amp;&amp;er}</w:t>
             </w:r>
             <w:r>
               <w:rPr>
@@ -31119,33 +30203,7 @@
                 <w:szCs w:val="24"/>
                 <w:rtl/>
               </w:rPr>
-              <w:t xml:space="preserve"> </w:t>
-            </w:r>
-            <w:proofErr w:type="spellStart"/>
-            <w:r>
-              <w:rPr>
-                <w:rFonts w:ascii="Tahoma" w:hAnsi="Tahoma" w:cs="Tahoma" w:hint="cs"/>
-                <w:b/>
-                <w:bCs/>
-                <w:color w:val="FFFFFF" w:themeColor="background1"/>
-                <w:sz w:val="24"/>
-                <w:szCs w:val="24"/>
-                <w:rtl/>
-              </w:rPr>
-              <w:t>לנק</w:t>
-            </w:r>
-            <w:proofErr w:type="spellEnd"/>
-            <w:r>
-              <w:rPr>
-                <w:rFonts w:ascii="Tahoma" w:hAnsi="Tahoma" w:cs="Tahoma" w:hint="cs"/>
-                <w:b/>
-                <w:bCs/>
-                <w:color w:val="FFFFFF" w:themeColor="background1"/>
-                <w:sz w:val="24"/>
-                <w:szCs w:val="24"/>
-                <w:rtl/>
-              </w:rPr>
-              <w:t>' כניסה</w:t>
+              <w:t xml:space="preserve"> לנק' כניסה</w:t>
             </w:r>
           </w:p>
           <w:p>
@@ -32089,7 +31147,6 @@
                 <w:rtl/>
               </w:rPr>
             </w:pPr>
-            <w:proofErr w:type="spellStart"/>
             <w:r>
               <w:rPr>
                 <w:rFonts w:ascii="Tahoma" w:hAnsi="Tahoma" w:cs="Tahoma"/>
@@ -32097,7 +31154,6 @@
               </w:rPr>
               <w:t>user_name</w:t>
             </w:r>
-            <w:proofErr w:type="spellEnd"/>
           </w:p>
         </w:tc>
         <w:tc>
@@ -32249,7 +31305,6 @@
                 <w:rtl/>
               </w:rPr>
             </w:pPr>
-            <w:proofErr w:type="spellStart"/>
             <w:r>
               <w:rPr>
                 <w:rFonts w:ascii="Tahoma" w:hAnsi="Tahoma" w:cs="Tahoma"/>
@@ -32257,7 +31312,6 @@
               </w:rPr>
               <w:t>enable_push_notifications</w:t>
             </w:r>
-            <w:proofErr w:type="spellEnd"/>
           </w:p>
         </w:tc>
         <w:tc>
@@ -32376,27 +31430,7 @@
                 <w:sz w:val="16"/>
                 <w:szCs w:val="16"/>
               </w:rPr>
-              <w:t>Login received. Please complete ascii checksum.{</w:t>
-            </w:r>
-            <w:proofErr w:type="spellStart"/>
-            <w:r>
-              <w:rPr>
-                <w:rFonts w:ascii="Tahoma" w:hAnsi="Tahoma" w:cs="Tahoma"/>
-                <w:color w:val="000000" w:themeColor="text1"/>
-                <w:sz w:val="16"/>
-                <w:szCs w:val="16"/>
-              </w:rPr>
-              <w:t>gli</w:t>
-            </w:r>
-            <w:proofErr w:type="spellEnd"/>
-            <w:r>
-              <w:rPr>
-                <w:rFonts w:ascii="Tahoma" w:hAnsi="Tahoma" w:cs="Tahoma"/>
-                <w:color w:val="000000" w:themeColor="text1"/>
-                <w:sz w:val="16"/>
-                <w:szCs w:val="16"/>
-              </w:rPr>
-              <w:t>&amp;&amp;er}</w:t>
+              <w:t>Login received. Please complete ascii checksum.{gli&amp;&amp;er}</w:t>
             </w:r>
             <w:r>
               <w:rPr>
@@ -32460,33 +31494,7 @@
                 <w:szCs w:val="24"/>
                 <w:rtl/>
               </w:rPr>
-              <w:t xml:space="preserve"> </w:t>
-            </w:r>
-            <w:proofErr w:type="spellStart"/>
-            <w:r>
-              <w:rPr>
-                <w:rFonts w:ascii="Tahoma" w:hAnsi="Tahoma" w:cs="Tahoma" w:hint="cs"/>
-                <w:b/>
-                <w:bCs/>
-                <w:color w:val="FFFFFF" w:themeColor="background1"/>
-                <w:sz w:val="24"/>
-                <w:szCs w:val="24"/>
-                <w:rtl/>
-              </w:rPr>
-              <w:t>לנק</w:t>
-            </w:r>
-            <w:proofErr w:type="spellEnd"/>
-            <w:r>
-              <w:rPr>
-                <w:rFonts w:ascii="Tahoma" w:hAnsi="Tahoma" w:cs="Tahoma" w:hint="cs"/>
-                <w:b/>
-                <w:bCs/>
-                <w:color w:val="FFFFFF" w:themeColor="background1"/>
-                <w:sz w:val="24"/>
-                <w:szCs w:val="24"/>
-                <w:rtl/>
-              </w:rPr>
-              <w:t>' כניסה</w:t>
+              <w:t xml:space="preserve"> לנק' כניסה</w:t>
             </w:r>
           </w:p>
           <w:p>
@@ -33315,27 +32323,7 @@
                 <w:sz w:val="16"/>
                 <w:szCs w:val="16"/>
               </w:rPr>
-              <w:t>110#{</w:t>
-            </w:r>
-            <w:proofErr w:type="spellStart"/>
-            <w:r>
-              <w:rPr>
-                <w:rFonts w:ascii="Tahoma" w:hAnsi="Tahoma" w:cs="Tahoma"/>
-                <w:color w:val="000000" w:themeColor="text1"/>
-                <w:sz w:val="16"/>
-                <w:szCs w:val="16"/>
-              </w:rPr>
-              <w:t>gli</w:t>
-            </w:r>
-            <w:proofErr w:type="spellEnd"/>
-            <w:r>
-              <w:rPr>
-                <w:rFonts w:ascii="Tahoma" w:hAnsi="Tahoma" w:cs="Tahoma"/>
-                <w:color w:val="000000" w:themeColor="text1"/>
-                <w:sz w:val="16"/>
-                <w:szCs w:val="16"/>
-              </w:rPr>
-              <w:t>&amp;&amp;er}693##</w:t>
+              <w:t>110#{gli&amp;&amp;er}693##</w:t>
             </w:r>
           </w:p>
         </w:tc>
@@ -33709,33 +32697,7 @@
                 <w:szCs w:val="24"/>
                 <w:rtl/>
               </w:rPr>
-              <w:t xml:space="preserve"> </w:t>
-            </w:r>
-            <w:proofErr w:type="spellStart"/>
-            <w:r>
-              <w:rPr>
-                <w:rFonts w:ascii="Tahoma" w:hAnsi="Tahoma" w:cs="Tahoma" w:hint="cs"/>
-                <w:b/>
-                <w:bCs/>
-                <w:color w:val="FFFFFF" w:themeColor="background1"/>
-                <w:sz w:val="24"/>
-                <w:szCs w:val="24"/>
-                <w:rtl/>
-              </w:rPr>
-              <w:t>לנק</w:t>
-            </w:r>
-            <w:proofErr w:type="spellEnd"/>
-            <w:r>
-              <w:rPr>
-                <w:rFonts w:ascii="Tahoma" w:hAnsi="Tahoma" w:cs="Tahoma" w:hint="cs"/>
-                <w:b/>
-                <w:bCs/>
-                <w:color w:val="FFFFFF" w:themeColor="background1"/>
-                <w:sz w:val="24"/>
-                <w:szCs w:val="24"/>
-                <w:rtl/>
-              </w:rPr>
-              <w:t>' כניסה</w:t>
+              <w:t xml:space="preserve"> לנק' כניסה</w:t>
             </w:r>
           </w:p>
           <w:p>
@@ -37550,10 +36512,30 @@
     <w:qFormat/>
     <w:rsid w:val="00ED6BC3"/>
   </w:style>
+  <w:style w:type="paragraph" w:styleId="1">
+    <w:name w:val="heading 1"/>
+    <w:basedOn w:val="a"/>
+    <w:next w:val="a"/>
+    <w:link w:val="10"/>
+    <w:uiPriority w:val="9"/>
+    <w:qFormat/>
+    <w:rsid w:val="00B950D6"/>
+    <w:pPr>
+      <w:keepNext/>
+      <w:keepLines/>
+      <w:spacing w:before="240" w:after="0"/>
+      <w:outlineLvl w:val="0"/>
+    </w:pPr>
+    <w:rPr>
+      <w:rFonts w:asciiTheme="majorHAnsi" w:eastAsiaTheme="majorEastAsia" w:hAnsiTheme="majorHAnsi" w:cstheme="majorBidi"/>
+      <w:color w:val="2E74B5" w:themeColor="accent1" w:themeShade="BF"/>
+      <w:sz w:val="32"/>
+      <w:szCs w:val="32"/>
+    </w:rPr>
+  </w:style>
   <w:style w:type="character" w:default="1" w:styleId="a0">
     <w:name w:val="Default Paragraph Font"/>
     <w:uiPriority w:val="1"/>
-    <w:semiHidden/>
     <w:unhideWhenUsed/>
   </w:style>
   <w:style w:type="table" w:default="1" w:styleId="a1">
@@ -37747,6 +36729,19 @@
     <w:rPr>
       <w:color w:val="605E5C"/>
       <w:shd w:val="clear" w:color="auto" w:fill="E1DFDD"/>
+    </w:rPr>
+  </w:style>
+  <w:style w:type="character" w:customStyle="1" w:styleId="10">
+    <w:name w:val="כותרת 1 תו"/>
+    <w:basedOn w:val="a0"/>
+    <w:link w:val="1"/>
+    <w:uiPriority w:val="9"/>
+    <w:rsid w:val="00B950D6"/>
+    <w:rPr>
+      <w:rFonts w:asciiTheme="majorHAnsi" w:eastAsiaTheme="majorEastAsia" w:hAnsiTheme="majorHAnsi" w:cstheme="majorBidi"/>
+      <w:color w:val="2E74B5" w:themeColor="accent1" w:themeShade="BF"/>
+      <w:sz w:val="32"/>
+      <w:szCs w:val="32"/>
     </w:rPr>
   </w:style>
 </w:styles>
@@ -39843,6 +38838,35 @@
         </w:p>
       </w:docPartBody>
     </w:docPart>
+    <w:docPart>
+      <w:docPartPr>
+        <w:name w:val="6EB4E93FAEFD4BDB8C7E64A73C2D3905"/>
+        <w:category>
+          <w:name w:val="כללי"/>
+          <w:gallery w:val="placeholder"/>
+        </w:category>
+        <w:types>
+          <w:type w:val="bbPlcHdr"/>
+        </w:types>
+        <w:behaviors>
+          <w:behavior w:val="content"/>
+        </w:behaviors>
+        <w:guid w:val="{835BC7A9-B63C-491D-9474-0167EDB93515}"/>
+      </w:docPartPr>
+      <w:docPartBody>
+        <w:p>
+          <w:pPr>
+            <w:pStyle w:val="6EB4E93FAEFD4BDB8C7E64A73C2D3905"/>
+          </w:pPr>
+          <w:r>
+            <w:rPr>
+              <w:rStyle w:val="a3"/>
+            </w:rPr>
+            <w:t>Choose an item.</w:t>
+          </w:r>
+        </w:p>
+      </w:docPartBody>
+    </w:docPart>
   </w:docParts>
 </w:glossaryDocument>
 </file>
@@ -39898,6 +38922,13 @@
     <w:pitch w:val="variable"/>
     <w:sig w:usb0="E0002EFF" w:usb1="C000785B" w:usb2="00000009" w:usb3="00000000" w:csb0="000001FF" w:csb1="00000000"/>
   </w:font>
+  <w:font w:name="Calibri Light">
+    <w:panose1 w:val="020F0302020204030204"/>
+    <w:charset w:val="00"/>
+    <w:family w:val="swiss"/>
+    <w:pitch w:val="variable"/>
+    <w:sig w:usb0="E4002EFF" w:usb1="C200247B" w:usb2="00000009" w:usb3="00000000" w:csb0="000001FF" w:csb1="00000000"/>
+  </w:font>
   <w:font w:name="Segoe UI">
     <w:panose1 w:val="020B0502040204020203"/>
     <w:charset w:val="00"/>
@@ -39911,13 +38942,6 @@
     <w:family w:val="swiss"/>
     <w:pitch w:val="variable"/>
     <w:sig w:usb0="E1002EFF" w:usb1="C000605B" w:usb2="00000029" w:usb3="00000000" w:csb0="000101FF" w:csb1="00000000"/>
-  </w:font>
-  <w:font w:name="Calibri Light">
-    <w:panose1 w:val="020F0302020204030204"/>
-    <w:charset w:val="00"/>
-    <w:family w:val="swiss"/>
-    <w:pitch w:val="variable"/>
-    <w:sig w:usb0="E4002EFF" w:usb1="C200247B" w:usb2="00000009" w:usb3="00000000" w:csb0="000001FF" w:csb1="00000000"/>
   </w:font>
   <w:font w:name="Aptos">
     <w:charset w:val="00"/>
@@ -39957,7 +38981,9 @@
     <w:rsid w:val="00265683"/>
     <w:rsid w:val="00295788"/>
     <w:rsid w:val="003C1237"/>
+    <w:rsid w:val="00444306"/>
     <w:rsid w:val="00451509"/>
+    <w:rsid w:val="004F76AB"/>
     <w:rsid w:val="00512063"/>
     <w:rsid w:val="005A14EC"/>
     <w:rsid w:val="005C20E4"/>
@@ -39975,6 +39001,7 @@
     <w:rsid w:val="008809C5"/>
     <w:rsid w:val="00987615"/>
     <w:rsid w:val="009C29DB"/>
+    <w:rsid w:val="00A26258"/>
     <w:rsid w:val="00A5481F"/>
     <w:rsid w:val="00A9299C"/>
     <w:rsid w:val="00B03229"/>
@@ -40442,7 +39469,7 @@
     <w:basedOn w:val="a0"/>
     <w:uiPriority w:val="99"/>
     <w:semiHidden/>
-    <w:rsid w:val="00844F94"/>
+    <w:rsid w:val="00A26258"/>
     <w:rPr>
       <w:color w:val="808080"/>
     </w:rPr>
@@ -41448,6 +40475,20 @@
       <w14:ligatures w14:val="standardContextual"/>
     </w:rPr>
   </w:style>
+  <w:style w:type="paragraph" w:customStyle="1" w:styleId="6EB4E93FAEFD4BDB8C7E64A73C2D3905">
+    <w:name w:val="6EB4E93FAEFD4BDB8C7E64A73C2D3905"/>
+    <w:rsid w:val="00A26258"/>
+    <w:pPr>
+      <w:bidi/>
+      <w:spacing w:line="278" w:lineRule="auto"/>
+    </w:pPr>
+    <w:rPr>
+      <w:kern w:val="2"/>
+      <w:sz w:val="24"/>
+      <w:szCs w:val="24"/>
+      <w14:ligatures w14:val="standardContextual"/>
+    </w:rPr>
+  </w:style>
 </w:styles>
 </file>
 

</xml_diff>